<commit_message>
Add another project card
</commit_message>
<xml_diff>
--- a/assets/files/Nurshazana Binti Malek-Resume-IT Professionals.docx
+++ b/assets/files/Nurshazana Binti Malek-Resume-IT Professionals.docx
@@ -26,13 +26,13 @@
           <w:lang w:val="it-IT"/>
         </w:rPr>
         <w:drawing>
-          <wp:anchor distT="0" distB="0" distL="114300" distR="114300" simplePos="0" relativeHeight="251669504" behindDoc="0" locked="0" layoutInCell="1" allowOverlap="1" wp14:anchorId="743A1DDD" wp14:editId="470712D5">
+          <wp:anchor distT="0" distB="0" distL="114300" distR="114300" simplePos="0" relativeHeight="251669504" behindDoc="0" locked="0" layoutInCell="1" allowOverlap="1" wp14:anchorId="743A1DDD" wp14:editId="5F43872D">
             <wp:simplePos x="0" y="0"/>
             <wp:positionH relativeFrom="column">
               <wp:posOffset>0</wp:posOffset>
             </wp:positionH>
             <wp:positionV relativeFrom="paragraph">
-              <wp:posOffset>0</wp:posOffset>
+              <wp:posOffset>38100</wp:posOffset>
             </wp:positionV>
             <wp:extent cx="746760" cy="746760"/>
             <wp:effectExtent l="0" t="0" r="0" b="0"/>
@@ -86,6 +86,131 @@
           <w:rFonts w:ascii="Calibri" w:hAnsi="Calibri" w:cs="Calibri"/>
           <w:b/>
           <w:bCs/>
+          <w:noProof/>
+          <w:sz w:val="32"/>
+          <w:szCs w:val="32"/>
+          <w:lang w:val="it-IT"/>
+        </w:rPr>
+        <mc:AlternateContent>
+          <mc:Choice Requires="wps">
+            <w:drawing>
+              <wp:anchor distT="0" distB="0" distL="114300" distR="114300" simplePos="0" relativeHeight="251672576" behindDoc="0" locked="0" layoutInCell="1" allowOverlap="1" wp14:anchorId="2CA41C8B" wp14:editId="7DE7F621">
+                <wp:simplePos x="0" y="0"/>
+                <wp:positionH relativeFrom="column">
+                  <wp:posOffset>-327660</wp:posOffset>
+                </wp:positionH>
+                <wp:positionV relativeFrom="paragraph">
+                  <wp:posOffset>-297180</wp:posOffset>
+                </wp:positionV>
+                <wp:extent cx="1455420" cy="297180"/>
+                <wp:effectExtent l="0" t="0" r="11430" b="26670"/>
+                <wp:wrapNone/>
+                <wp:docPr id="1162213554" name="Text Box 9"/>
+                <wp:cNvGraphicFramePr/>
+                <a:graphic xmlns:a="http://schemas.openxmlformats.org/drawingml/2006/main">
+                  <a:graphicData uri="http://schemas.microsoft.com/office/word/2010/wordprocessingShape">
+                    <wps:wsp>
+                      <wps:cNvSpPr txBox="1"/>
+                      <wps:spPr>
+                        <a:xfrm>
+                          <a:off x="0" y="0"/>
+                          <a:ext cx="1455420" cy="297180"/>
+                        </a:xfrm>
+                        <a:prstGeom prst="rect">
+                          <a:avLst/>
+                        </a:prstGeom>
+                        <a:solidFill>
+                          <a:schemeClr val="lt1"/>
+                        </a:solidFill>
+                        <a:ln w="6350">
+                          <a:solidFill>
+                            <a:prstClr val="black"/>
+                          </a:solidFill>
+                        </a:ln>
+                      </wps:spPr>
+                      <wps:txbx>
+                        <w:txbxContent>
+                          <w:p>
+                            <w:pPr>
+                              <w:jc w:val="center"/>
+                              <w:rPr>
+                                <w:rFonts w:ascii="Calibri" w:hAnsi="Calibri" w:cs="Calibri"/>
+                              </w:rPr>
+                            </w:pPr>
+                            <w:r>
+                              <w:rPr>
+                                <w:rFonts w:ascii="Calibri" w:hAnsi="Calibri" w:cs="Calibri"/>
+                              </w:rPr>
+                              <w:t xml:space="preserve">Scan for Portfolio </w:t>
+                            </w:r>
+                            <w:r>
+                              <w:rPr>
+                                <w:rFonts w:ascii="Calibri" w:hAnsi="Calibri" w:cs="Calibri"/>
+                              </w:rPr>
+                              <w:sym w:font="Symbol" w:char="F0AF"/>
+                            </w:r>
+                          </w:p>
+                        </w:txbxContent>
+                      </wps:txbx>
+                      <wps:bodyPr rot="0" spcFirstLastPara="0" vertOverflow="overflow" horzOverflow="overflow" vert="horz" wrap="square" lIns="91440" tIns="45720" rIns="91440" bIns="45720" numCol="1" spcCol="0" rtlCol="0" fromWordArt="0" anchor="t" anchorCtr="0" forceAA="0" compatLnSpc="1">
+                        <a:prstTxWarp prst="textNoShape">
+                          <a:avLst/>
+                        </a:prstTxWarp>
+                        <a:noAutofit/>
+                      </wps:bodyPr>
+                    </wps:wsp>
+                  </a:graphicData>
+                </a:graphic>
+                <wp14:sizeRelH relativeFrom="margin">
+                  <wp14:pctWidth>0</wp14:pctWidth>
+                </wp14:sizeRelH>
+                <wp14:sizeRelV relativeFrom="margin">
+                  <wp14:pctHeight>0</wp14:pctHeight>
+                </wp14:sizeRelV>
+              </wp:anchor>
+            </w:drawing>
+          </mc:Choice>
+          <mc:Fallback>
+            <w:pict>
+              <v:shapetype w14:anchorId="2CA41C8B" id="_x0000_t202" coordsize="21600,21600" o:spt="202" path="m,l,21600r21600,l21600,xe">
+                <v:stroke joinstyle="miter"/>
+                <v:path gradientshapeok="t" o:connecttype="rect"/>
+              </v:shapetype>
+              <v:shape id="Text Box 9" o:spid="_x0000_s1026" type="#_x0000_t202" style="position:absolute;left:0;text-align:left;margin-left:-25.8pt;margin-top:-23.4pt;width:114.6pt;height:23.4pt;z-index:251672576;visibility:visible;mso-wrap-style:square;mso-width-percent:0;mso-height-percent:0;mso-wrap-distance-left:9pt;mso-wrap-distance-top:0;mso-wrap-distance-right:9pt;mso-wrap-distance-bottom:0;mso-position-horizontal:absolute;mso-position-horizontal-relative:text;mso-position-vertical:absolute;mso-position-vertical-relative:text;mso-width-percent:0;mso-height-percent:0;mso-width-relative:margin;mso-height-relative:margin;v-text-anchor:top" o:gfxdata="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" fillcolor="white [3201]" strokeweight=".5pt">
+                <v:textbox>
+                  <w:txbxContent>
+                    <w:p>
+                      <w:pPr>
+                        <w:jc w:val="center"/>
+                        <w:rPr>
+                          <w:rFonts w:ascii="Calibri" w:hAnsi="Calibri" w:cs="Calibri"/>
+                        </w:rPr>
+                      </w:pPr>
+                      <w:r>
+                        <w:rPr>
+                          <w:rFonts w:ascii="Calibri" w:hAnsi="Calibri" w:cs="Calibri"/>
+                        </w:rPr>
+                        <w:t xml:space="preserve">Scan for Portfolio </w:t>
+                      </w:r>
+                      <w:r>
+                        <w:rPr>
+                          <w:rFonts w:ascii="Calibri" w:hAnsi="Calibri" w:cs="Calibri"/>
+                        </w:rPr>
+                        <w:sym w:font="Symbol" w:char="F0AF"/>
+                      </w:r>
+                    </w:p>
+                  </w:txbxContent>
+                </v:textbox>
+              </v:shape>
+            </w:pict>
+          </mc:Fallback>
+        </mc:AlternateContent>
+      </w:r>
+      <w:r>
+        <w:rPr>
+          <w:rFonts w:ascii="Calibri" w:hAnsi="Calibri" w:cs="Calibri"/>
+          <w:b/>
+          <w:bCs/>
           <w:sz w:val="32"/>
           <w:szCs w:val="32"/>
           <w:lang w:val="it-IT"/>
@@ -172,12 +297,14 @@
         <w:rPr>
           <w:rFonts w:ascii="Calibri" w:hAnsi="Calibri" w:cs="Calibri"/>
           <w:szCs w:val="24"/>
+          <w:lang w:val="it-IT"/>
         </w:rPr>
       </w:pPr>
       <w:r>
         <w:rPr>
           <w:rFonts w:ascii="Calibri" w:hAnsi="Calibri" w:cs="Calibri"/>
           <w:szCs w:val="24"/>
+          <w:lang w:val="it-IT"/>
         </w:rPr>
         <w:t>Seremban, Negeri Sembilan.</w:t>
       </w:r>
@@ -190,6 +317,7 @@
           <w:b/>
           <w:bCs/>
           <w:szCs w:val="24"/>
+          <w:lang w:val="it-IT"/>
         </w:rPr>
       </w:pPr>
       <w:r>

</xml_diff>